<commit_message>
Reconcile complete thesis and restore full study framing
</commit_message>
<xml_diff>
--- a/Finals Revised Paper WASD.docx
+++ b/Finals Revised Paper WASD.docx
@@ -17,14 +17,10 @@
       </w:pPr>
       <w:r>
         <w:rPr>
-          <w:rFonts w:ascii="Arial" w:eastAsia="Arial" w:hAnsi="Arial" w:cs="Arial"/>
+          <w:b/>
           <w:i/>
-          <w:iCs/>
-          <w:sz w:val="32"/>
-          <w:szCs w:val="32"/>
-          <w:lang w:val="en-PH"/>
         </w:rPr>
-        <w:t xml:space="preserve">AI-Based Identification of PAN12 Conversations Associated with Listed Predator Authors Using Contextual and Behavioral Trajectory Analysis</w:t>
+        <w:t>AI-Based Detection of Grooming-Related Interactions in Chat Conversations Using Contextual and Behavioral Analysis</w:t>
       </w:r>
     </w:p>
     <w:p>
@@ -459,12 +455,6 @@
         </w:rPr>
       </w:pPr>
       <w:r>
-        <w:rPr>
-          <w:rFonts w:asciiTheme="minorHAnsi" w:hAnsiTheme="minorHAnsi"/>
-          <w:b/>
-          <w:bCs/>
-          <w:color w:val="auto"/>
-        </w:rPr>
         <w:t>I. Introduction</w:t>
       </w:r>
     </w:p>
@@ -473,55 +463,63 @@
         <w:pStyle w:val="Heading2"/>
       </w:pPr>
       <w:r>
-        <w:t xml:space="preserve">1.1 Background of the Study</w:t>
-      </w:r>
-    </w:p>
-    <w:p>
-      <w:pPr>
-        <w:pStyle w:val="FirstParagraph"/>
-      </w:pPr>
-      <w:r>
-        <w:t xml:space="preserve">The rapid growth of online multiplayer games and interactive digital platforms has made real-time chat central to online social activity. These systems support collaboration and community building, but they also create channels through which grooming-related interactions and other forms of harmful conduct can develop [1], [2], [3]. Keyword filters and user reports remain useful first-line controls, yet they are poorly suited to evidence distributed across ordinary-looking turns, altered spellings, coded language, and gradual shifts in conversational behavior [4], [5], [6], [7], [8].</w:t>
-      </w:r>
-    </w:p>
-    <w:p>
-      <w:pPr>
-        <w:pStyle w:val="BodyText"/>
-      </w:pPr>
-      <w:r>
-        <w:t xml:space="preserve">Context-aware modeling addresses this limitation by evaluating a turn in relation to surrounding messages and by tracking how evidence changes across an interaction [6], [9]. This is particularly relevant to grooming-related risk because a single greeting, question, or request may be ambiguous, while its placement within a sustained exchange can be informative. The resulting technical problem is not merely text classification; it is the aggregation of sparse and noisy conversational evidence into a reliable interaction-level decision.</w:t>
-      </w:r>
-    </w:p>
-    <w:p>
-      <w:pPr>
-        <w:pStyle w:val="BodyText"/>
-      </w:pPr>
-      <w:r>
-        <w:t xml:space="preserve">The PAN-2012 Sexual Predator Identification corpus provides a strong benchmark for this problem because it combines large-scale chronological chat records, persistent speaker identifiers, and an official predator-author list [13]. These properties support two safeguards essential to the present study: conversation-level evaluation against a verifiable endpoint and connected-author partitioning that prevents any author from appearing across development and final-test partitions. PAN12 was therefore selected not only for its scale, but because its structure permits a rigorous test of temporal modeling under author-disjoint evaluation.</w:t>
-      </w:r>
-    </w:p>
-    <w:p>
-      <w:pPr>
-        <w:pStyle w:val="BodyText"/>
-      </w:pPr>
-      <w:r>
-        <w:t xml:space="preserve">This study operationalizes a positive case as a dyadic PAN12 conversation containing at least one author on the official predator list. It implements a two-layer architecture. Layer 1 uses DistilBERT with the current turn and up to two preceding turns to estimate a contextualized predator-author proxy for the current speaker. Layer 2 receives the chronological sequence of seven trajectory features constructed from proxy scores, current-turn base-encoder embeddings, and cumulative speaker-turn counts, then produces the final conversation-level score. The proxy is not interpreted as a message-level grooming label; it is an intermediate signal whose value is tested through conversation-level aggregation.</w:t>
-      </w:r>
-    </w:p>
-    <w:p>
-      <w:pPr>
-        <w:pStyle w:val="BodyText"/>
-      </w:pPr>
-      <w:r>
-        <w:t xml:space="preserve">The primary scientific comparison is deliberately controlled: the seven-feature LSTM and a validation-fitted weighted scorer receive the same seven trajectory inputs. This controls input availability and directly compares learned recurrent aggregation with validation-fitted weighted aggregation. On the locked author-disjoint final test, the primary LSTM achieved a PR-AUC of 0.9153, precision of 0.8511, recall of 0.9091, and F0.5 of 0.8621. It exceeded the matched weighted scorer by 0.1103 PR-AUC and 0.1121 F0.5, with both paired 95% bootstrap intervals above zero. These results establish that learned temporal aggregation contributes substantial predictive value for the PAN12 conversation endpoint.</w:t>
-      </w:r>
-    </w:p>
-    <w:p>
-      <w:pPr>
-        <w:pStyle w:val="BodyText"/>
-      </w:pPr>
-      <w:r>
-        <w:t xml:space="preserve">This study also supports the United Nations Sustainable Development Goals (SDGs), particularly SDG 9 (Industry, Innovation and Infrastructure) and SDG 16 (Peace, Justice and Strong Institutions). It supports SDG 9 by advancing a reproducible machine-learning approach for human-reviewed online-safety screening. It supports SDG 16 by contributing methods that can inform the development of safer and more accountable digital communication systems.</w:t>
+        <w:t>1.1 Background of the Study</w:t>
+      </w:r>
+    </w:p>
+    <w:p>
+      <w:pPr>
+        <w:pStyle w:val="FirstParagraph"/>
+      </w:pPr>
+      <w:r>
+        <w:t>The rapid growth of online multiplayer games and interactive digital platforms has made real-time chat a primary channel for collaboration, social interaction, and community building. These environments also create opportunities for grooming-related interactions and other harmful conduct to develop across sustained conversations [1], [2], [3]. Many moderation systems continue to rely on keyword filtering and user reports, which remain useful first-line controls but are often insufficient for complex, context-dependent threats [4], [5].</w:t>
+      </w:r>
+    </w:p>
+    <w:p>
+      <w:pPr>
+        <w:pStyle w:val="FirstParagraph"/>
+      </w:pPr>
+      <w:r>
+        <w:t>Traditional moderation methods primarily detect explicit terms or predefined patterns. They can identify straightforward violations such as profanity, yet altered spellings, special characters, coded language, and other obfuscation techniques can bypass static rules [6], [7], [8]. More importantly, an ordinary-looking message may acquire a different meaning when interpreted with surrounding turns, speaker behavior, and the progression of the interaction [2], [9]. Reliance on user reporting is also reactive and may delay review of interactions that do not contain immediately obvious violations [5].</w:t>
+      </w:r>
+    </w:p>
+    <w:p>
+      <w:pPr>
+        <w:pStyle w:val="FirstParagraph"/>
+      </w:pPr>
+      <w:r>
+        <w:t>A central challenge is therefore the number of harmful or concerning interactions that conventional systems may miss. In a safety-oriented moderation setting, false negatives are especially important because every missed conversation represents an interaction that receives no timely review. Improving detection coverage requires methods capable of combining local language context with evidence that develops across multiple turns.</w:t>
+      </w:r>
+    </w:p>
+    <w:p>
+      <w:pPr>
+        <w:pStyle w:val="FirstParagraph"/>
+      </w:pPr>
+      <w:r>
+        <w:t>Advances in machine learning and natural language processing provide a practical basis for moving beyond isolated-message filtering [9], [10]. Transformer models can represent a message in relation to its preceding context, while sequence models can learn how scores and behavioral indicators change over time. Together, these techniques support a moderation architecture that analyzes both what is being communicated and how the interaction develops.</w:t>
+      </w:r>
+    </w:p>
+    <w:p>
+      <w:pPr>
+        <w:pStyle w:val="FirstParagraph"/>
+      </w:pPr>
+      <w:r>
+        <w:t>This study develops an AI-powered moderation module that combines contextual language analysis with behavioral trajectory modeling. Layer 1 uses DistilBERT to evaluate the current turn together with up to two preceding turns. Layer 2 uses an LSTM to aggregate a chronological sequence of seven trajectory features reflecting score level and change, semantic movement, and speaker-turn structure. The module is designed to complement keyword filters and reporting mechanisms by prioritizing conversations that warrant human review.</w:t>
+      </w:r>
+    </w:p>
+    <w:p>
+      <w:pPr>
+        <w:pStyle w:val="FirstParagraph"/>
+      </w:pPr>
+      <w:r>
+        <w:t>The primary empirical evaluation uses the PAN-2012 Sexual Predator Identification corpus because it provides large-scale chronological conversations, persistent speaker identifiers, and an official predator-author list [13]. For measurement, a positive case is operationalized as a dyadic conversation containing at least one officially listed predator author. This author-derived endpoint supplies reproducible supervision for evaluating the complete architecture, while the system's broader research purpose remains the contextual and behavioral detection of grooming-related interactions. The endpoint does not imply that every turn written by a listed author contains grooming behavior.</w:t>
+      </w:r>
+    </w:p>
+    <w:p>
+      <w:pPr>
+        <w:pStyle w:val="FirstParagraph"/>
+      </w:pPr>
+      <w:r>
+        <w:t>By developing and evaluating a complete two-layer prototype, the study investigates whether contextual and behavioral sequence analysis can reduce the interactions missed by conventional moderation approaches. It also contributes to Sustainable Development Goal 9 through innovation in AI-assisted digital-safety infrastructure and to Sustainable Development Goal 16 by supporting more accountable and responsive mechanisms for identifying potentially harmful online interactions.</w:t>
       </w:r>
     </w:p>
     <w:p>
@@ -529,31 +527,31 @@
         <w:pStyle w:val="Heading2"/>
       </w:pPr>
       <w:r>
-        <w:t xml:space="preserve">1.2 Statement of the Problem</w:t>
-      </w:r>
-    </w:p>
-    <w:p>
-      <w:pPr>
-        <w:pStyle w:val="FirstParagraph"/>
-      </w:pPr>
-      <w:r>
-        <w:t xml:space="preserve">Keyword and rule-based moderation can detect explicit lexical violations, but they do not directly model the order, persistence, or interaction pattern of contextual evidence. A contextual classifier can improve local interpretation, yet reducing a conversation to its single maximum score discards the trajectory through which evidence accumulates or changes. The central research problem is therefore whether a recurrent model can use the same engineered trajectory information more effectively than static aggregation methods when identifying PAN12 conversations associated with officially listed predator authors.</w:t>
-      </w:r>
-    </w:p>
-    <w:p>
-      <w:pPr>
-        <w:pStyle w:val="BodyText"/>
-      </w:pPr>
-      <w:r>
-        <w:t xml:space="preserve">The study addresses this problem under severe class imbalance and a strict author-disjoint protocol. It evaluates all methods on identical conversation IDs, selects every learned configuration and threshold using validation data, and reserves the final partition for one locked comparison. This design permits a direct assessment of predictive performance while preventing author overlap and final-test threshold tuning.</w:t>
-      </w:r>
-    </w:p>
-    <w:p>
-      <w:pPr>
-        <w:pStyle w:val="BodyText"/>
-      </w:pPr>
-      <w:r>
-        <w:t xml:space="preserve">This study seeks to answer the following questions:</w:t>
+        <w:t>1.2 Statement of the Problem</w:t>
+      </w:r>
+    </w:p>
+    <w:p>
+      <w:pPr>
+        <w:pStyle w:val="FirstParagraph"/>
+      </w:pPr>
+      <w:r>
+        <w:t>Existing chat moderation systems are widely used, yet grooming-related and other harmful interactions persist [1], [2], [3]. Keyword-based filters, rule-based systems, and user-reporting mechanisms are effective for explicit and readily recognizable violations, but they are less capable of handling communication whose meaning depends on conversational context and behavioral progression [4], [5], [9].</w:t>
+      </w:r>
+    </w:p>
+    <w:p>
+      <w:pPr>
+        <w:pStyle w:val="FirstParagraph"/>
+      </w:pPr>
+      <w:r>
+        <w:t>The research problem addressed by this study is how an AI-powered moderation module can combine natural language processing, contextual analysis, and behavioral trajectory modeling to identify concerning interactions that static or isolated-message approaches may miss. The study develops a complete two-layer architecture and evaluates whether recurrent aggregation of chronological evidence improves detection coverage, particularly recall and false-negative reduction.</w:t>
+      </w:r>
+    </w:p>
+    <w:p>
+      <w:pPr>
+        <w:pStyle w:val="FirstParagraph"/>
+      </w:pPr>
+      <w:r>
+        <w:t>This study seeks to answer the following questions:</w:t>
       </w:r>
     </w:p>
     <w:p>
@@ -562,10 +560,7 @@
         <w:ind w:left="720" w:hanging="360"/>
       </w:pPr>
       <w:r>
-        <w:t xml:space="preserve">1. </w:t>
-      </w:r>
-      <w:r>
-        <w:t xml:space="preserve">How effectively do the keyword rule, aggregated Layer 1 proxy, weighted trajectory scorer, and LSTM-based models identify PAN12 conversations containing an officially listed predator author under author-disjoint evaluation?</w:t>
+        <w:t>1. How effective are existing chat moderation systems in detecting grooming-related interactions?</w:t>
       </w:r>
     </w:p>
     <w:p>
@@ -574,10 +569,7 @@
         <w:ind w:left="720" w:hanging="360"/>
       </w:pPr>
       <w:r>
-        <w:t xml:space="preserve">2. </w:t>
-      </w:r>
-      <w:r>
-        <w:t xml:space="preserve">Does the seven-feature trajectory LSTM outperform the matched seven-feature weighted scorer on PR-AUC, F0.5, precision, and recall?</w:t>
+        <w:t>2. What are the limitations of keyword-based and rule-based moderation approaches in handling context-dependent communication?</w:t>
       </w:r>
     </w:p>
     <w:p>
@@ -586,10 +578,7 @@
         <w:ind w:left="720" w:hanging="360"/>
       </w:pPr>
       <w:r>
-        <w:t xml:space="preserve">3. </w:t>
-      </w:r>
-      <w:r>
-        <w:t xml:space="preserve">How much does the trajectory LSTM improve conversation-level performance over the keyword rule and maximum Layer 1 proxy aggregation?</w:t>
+        <w:t>3. How can machine learning and natural language processing be utilized to analyze behavioral patterns and conversational context in chat systems?</w:t>
       </w:r>
     </w:p>
     <w:p>
@@ -598,10 +587,15 @@
         <w:ind w:left="720" w:hanging="360"/>
       </w:pPr>
       <w:r>
-        <w:t xml:space="preserve">4. </w:t>
-      </w:r>
-      <w:r>
-        <w:t xml:space="preserve">What additional predictive value is observed when the seven trajectory features are supplemented with 768-dimensional base DistilBERT embeddings?</w:t>
+        <w:t>4. To what extent can an AI-driven moderation module improve detection performance, particularly in terms of recall and reduction of false negatives, compared to existing approaches?</w:t>
+      </w:r>
+    </w:p>
+    <w:p>
+      <w:pPr>
+        <w:pStyle w:val="FirstParagraph"/>
+      </w:pPr>
+      <w:r>
+        <w:t>For quantitative evaluation, these questions are operationalized using the PAN12 author-derived conversation endpoint and a set of controlled comparison methods: a training-derived keyword rule, maximum Layer 1 proxy aggregation, a validation-fitted weighted trajectory scorer, and LSTM-based sequence models. Accordingly, the reported metrics establish performance for that conversation-level endpoint rather than exhaustive message-level grooming classification or grooming-onset detection.</w:t>
       </w:r>
     </w:p>
     <w:p>
@@ -609,7 +603,7 @@
         <w:pStyle w:val="Heading2"/>
       </w:pPr>
       <w:r>
-        <w:t xml:space="preserve">1.3 Objectives of the Study</w:t>
+        <w:t>1.3 Objectives of the Study</w:t>
       </w:r>
     </w:p>
     <w:p>
@@ -619,15 +613,12 @@
       <w:r>
         <w:rPr>
           <w:b/>
-          <w:bCs/>
+          <w:i w:val="0"/>
         </w:rPr>
-        <w:t xml:space="preserve">General Objective:</w:t>
-      </w:r>
-      <w:r>
-        <w:t xml:space="preserve"> </w:t>
-      </w:r>
-      <w:r>
-        <w:t xml:space="preserve">Develop and evaluate a two-layer contextual trajectory model for identifying PAN12 conversations containing an officially listed predator author under strict author-disjoint testing.</w:t>
+        <w:t>General Objective:</w:t>
+      </w:r>
+      <w:r>
+        <w:t xml:space="preserve"> Develop an AI-powered moderation module that enhances existing chat moderation systems by incorporating behavioral pattern analysis and contextual understanding to detect grooming-related interactions in chat environments.</w:t>
       </w:r>
     </w:p>
     <w:p>
@@ -641,57 +632,36 @@
       <w:r>
         <w:rPr>
           <w:b/>
-          <w:bCs/>
+          <w:i w:val="0"/>
         </w:rPr>
-        <w:t xml:space="preserve">Specific Objective:</w:t>
+        <w:t>Specific Objective:</w:t>
       </w:r>
     </w:p>
     <w:p>
       <w:pPr>
         <w:pStyle w:val="Compact"/>
-        <w:ind w:left="1080" w:hanging="360"/>
-      </w:pPr>
-      <w:r>
-        <w:t xml:space="preserve">1. </w:t>
-      </w:r>
-      <w:r>
-        <w:t xml:space="preserve">Fine-tune a context-conditioned DistilBERT classifier using official predator-author membership as an explicitly defined proxy target.</w:t>
+        <w:ind w:left="720" w:hanging="360"/>
+      </w:pPr>
+      <w:r>
+        <w:t>1. Evaluate the limitations and effectiveness of existing keyword-based and rule-based chat moderation systems in handling context-dependent communication.</w:t>
       </w:r>
     </w:p>
     <w:p>
       <w:pPr>
         <w:pStyle w:val="Compact"/>
-        <w:ind w:left="1080" w:hanging="360"/>
-      </w:pPr>
-      <w:r>
-        <w:t xml:space="preserve">2. </w:t>
-      </w:r>
-      <w:r>
-        <w:t xml:space="preserve">Construct seven chronological trajectory features and compare recurrent LSTM aggregation with a validation-fitted weighted scorer receiving the same inputs.</w:t>
+        <w:ind w:left="720" w:hanging="360"/>
+      </w:pPr>
+      <w:r>
+        <w:t>2. Design and develop an AI-based chat moderation module that applies machine learning and NLP techniques to analyze behavioral patterns and conversational context across multiple chat interactions.</w:t>
       </w:r>
     </w:p>
     <w:p>
       <w:pPr>
         <w:pStyle w:val="Compact"/>
-        <w:ind w:left="1080" w:hanging="360"/>
-      </w:pPr>
-      <w:r>
-        <w:t xml:space="preserve">3. </w:t>
-      </w:r>
-      <w:r>
-        <w:t xml:space="preserve">Evaluate the primary model, keyword rule, raw Layer 1 aggregation, weighted scorer, and enhanced-input LSTM on identical locked conversation partitions using PR-AUC, ROC-AUC, precision, recall, specificity, F1, F0.5, and confusion counts.</w:t>
-      </w:r>
-    </w:p>
-    <w:p>
-      <w:pPr>
-        <w:pStyle w:val="Compact"/>
-        <w:ind w:left="1080" w:hanging="360"/>
-      </w:pPr>
-      <w:r>
-        <w:t xml:space="preserve">4. </w:t>
-      </w:r>
-      <w:r>
-        <w:t xml:space="preserve">Quantify uncertainty and paired method differences by bootstrap resampling connected-author components.</w:t>
+        <w:ind w:left="720" w:hanging="360"/>
+      </w:pPr>
+      <w:r>
+        <w:t>3. Assess the improvement in detection performance of the proposed AI-driven module, specifically focusing on the reduction of false negatives compared to traditional keyword-based and report-driven approaches.</w:t>
       </w:r>
     </w:p>
     <w:p>
@@ -699,7 +669,7 @@
         <w:pStyle w:val="Heading2"/>
       </w:pPr>
       <w:r>
-        <w:t xml:space="preserve">1.4 Scope and Limitations</w:t>
+        <w:t>1.4 Scope and Limitations</w:t>
       </w:r>
     </w:p>
     <w:p>
@@ -707,31 +677,39 @@
         <w:pStyle w:val="Heading3"/>
       </w:pPr>
       <w:r>
-        <w:t xml:space="preserve">1.4.1 Scope of the Study</w:t>
-      </w:r>
-    </w:p>
-    <w:p>
-      <w:pPr>
-        <w:pStyle w:val="FirstParagraph"/>
-      </w:pPr>
-      <w:r>
-        <w:t xml:space="preserve">The primary experiment uses eligible dyadic conversations from the PAN12 training corpus with non-empty messages, chronological turn order, and valid conversation and author identifiers. The candidate pool contains 18,567 conversations and 218,114 turns. The official predator-author list is the sole source of supervision: Layer 1 uses current-author membership as a weak proxy target, and Layer 2 uses the derived conversation endpoint.</w:t>
-      </w:r>
-    </w:p>
-    <w:p>
-      <w:pPr>
-        <w:pStyle w:val="BodyText"/>
-      </w:pPr>
-      <w:r>
-        <w:t xml:space="preserve">The study compares five methods on identical connected-author partitions: a training-derived keyword rule, maximum Layer 1 proxy aggregation, a validation-fitted weighted trajectory scorer, a primary seven-feature LSTM, and a secondary LSTM that adds 768-dimensional base DistilBERT embeddings. The primary architecture comparison is the seven-feature LSTM against the seven-feature weighted scorer because both receive the same information.</w:t>
-      </w:r>
-    </w:p>
-    <w:p>
-      <w:pPr>
-        <w:pStyle w:val="BodyText"/>
-      </w:pPr>
-      <w:r>
-        <w:t xml:space="preserve">The prototype processes stored or locally entered messages in chronological order through offline sequential replay. It demonstrates how contextual scores and conversation trajectories can be inspected, but it is not evaluated as a live platform integration.</w:t>
+        <w:t>1.4.1 Scope of the Study</w:t>
+      </w:r>
+    </w:p>
+    <w:p>
+      <w:pPr>
+        <w:pStyle w:val="FirstParagraph"/>
+      </w:pPr>
+      <w:r>
+        <w:t>The study covers the design, implementation, and comparative evaluation of an AI-powered moderation module that combines contextual message analysis with behavioral trajectory modeling. The prototype is intended to augment, rather than replace, keyword filters, user reports, and human moderation by assigning conversation-level scores that can help prioritize review.</w:t>
+      </w:r>
+    </w:p>
+    <w:p>
+      <w:pPr>
+        <w:pStyle w:val="FirstParagraph"/>
+      </w:pPr>
+      <w:r>
+        <w:t>The completed architecture contains two learned layers. Layer 1 uses a context-conditioned DistilBERT classifier to produce an author-derived proxy score for each turn. Layer 2 analyzes the chronological sequence of seven trajectory features using an LSTM. The system also includes an offline sequential-replay interface through which stored or locally entered messages can be assessed turn by turn.</w:t>
+      </w:r>
+    </w:p>
+    <w:p>
+      <w:pPr>
+        <w:pStyle w:val="FirstParagraph"/>
+      </w:pPr>
+      <w:r>
+        <w:t>The primary experiment uses eligible dyadic conversations from the PAN12 training corpus. After the required validity and conversation-structure checks, the candidate pool contains 18,567 conversations and 218,114 turns. The official predator-author list is the sole source of primary supervision: Layer 1 uses current-author membership as weak supervision, while Layer 2 uses the derived conversation-level endpoint.</w:t>
+      </w:r>
+    </w:p>
+    <w:p>
+      <w:pPr>
+        <w:pStyle w:val="FirstParagraph"/>
+      </w:pPr>
+      <w:r>
+        <w:t>The study compares the proposed seven-feature LSTM with a training-derived keyword rule, maximum Layer 1 proxy aggregation, and a validation-fitted weighted trajectory scorer. A secondary LSTM supplemented with 768-dimensional base DistilBERT embeddings is evaluated separately. All methods are tested on identical author-disjoint conversation partitions, with particular attention to recall, false negatives, PR-AUC, F0.5, and paired performance differences.</w:t>
       </w:r>
     </w:p>
     <w:p>
@@ -739,23 +717,39 @@
         <w:pStyle w:val="Heading3"/>
       </w:pPr>
       <w:r>
-        <w:t xml:space="preserve">1.4.2 Limitations of the Study</w:t>
-      </w:r>
-    </w:p>
-    <w:p>
-      <w:pPr>
-        <w:pStyle w:val="FirstParagraph"/>
-      </w:pPr>
-      <w:r>
-        <w:t xml:space="preserve">The evaluated endpoint is PAN12 conversation-level predator-author presence. The experiment does not provide exhaustive message-level grooming labels and therefore does not measure grooming-message classification, grooming stage, onset, or intent at an individual turn. Author-derived Layer 1 supervision is necessarily coarse: a turn written by a listed author is a positive proxy observation even when that turn is linguistically ordinary.</w:t>
-      </w:r>
-    </w:p>
-    <w:p>
-      <w:pPr>
-        <w:pStyle w:val="BodyText"/>
-      </w:pPr>
-      <w:r>
-        <w:t xml:space="preserve">The final results establish generalization to unseen authors within the locked PAN12 partitions. They do not establish performance on contemporary gaming platforms, external corpora, Filipino or Taglish conversations, or live users. The offline prototype is intended for human-review decision support; latency, throughput, platform integration, and autonomous moderation are outside the evaluated scope.</w:t>
+        <w:t>1.4.2 Limitations of the Study</w:t>
+      </w:r>
+    </w:p>
+    <w:p>
+      <w:pPr>
+        <w:pStyle w:val="FirstParagraph"/>
+      </w:pPr>
+      <w:r>
+        <w:t>PAN12 does not provide exhaustive grooming labels for every training message. The author-derived Layer 1 target is therefore a weak proxy: a turn written by a listed author is positive for the training target even when its isolated wording is ordinary. The primary experiment consequently evaluates conversation-level predator-author presence and does not claim validated grooming-message classification, grooming-stage recognition, or true grooming-onset detection.</w:t>
+      </w:r>
+    </w:p>
+    <w:p>
+      <w:pPr>
+        <w:pStyle w:val="FirstParagraph"/>
+      </w:pPr>
+      <w:r>
+        <w:t>The primary evaluation does not include the project's locally generated synthetic conversations or other unreviewed candidate datasets. It also does not establish coverage of contemporary gaming slang, newly developed obfuscation strategies, Filipino or Taglish communication, or external platforms. PAN12 was processed as supplied; no independent English-language filter was used.</w:t>
+      </w:r>
+    </w:p>
+    <w:p>
+      <w:pPr>
+        <w:pStyle w:val="FirstParagraph"/>
+      </w:pPr>
+      <w:r>
+        <w:t>The prototype operates through controlled offline sequential replay and was not tested with real users or integrated into a live platform. Production latency, throughput, scalability, moderator outcomes, fairness, privacy performance, and autonomous enforcement remain outside the completed evaluation. Its present role is an experimentally evaluated moderation module and a basis for future human-review integration.</w:t>
+      </w:r>
+    </w:p>
+    <w:p>
+      <w:pPr>
+        <w:pStyle w:val="FirstParagraph"/>
+      </w:pPr>
+      <w:r>
+        <w:t>The system builds upon pretrained language models and a dyadic conversation design. Its performance is therefore influenced by the limitations of those models, the age and composition of PAN12, class imbalance, and the extent to which the selected trajectory features represent behavior in other environments.</w:t>
       </w:r>
     </w:p>
     <w:p>
@@ -763,15 +757,15 @@
         <w:pStyle w:val="Heading2"/>
       </w:pPr>
       <w:r>
-        <w:t xml:space="preserve">1.5 Significance of the Study</w:t>
-      </w:r>
-    </w:p>
-    <w:p>
-      <w:pPr>
-        <w:pStyle w:val="FirstParagraph"/>
-      </w:pPr>
-      <w:r>
-        <w:t xml:space="preserve">This section explains the importance and potential impact of the research, identifying key beneficiaries and contributions across multiple domains.</w:t>
+        <w:t>1.5 Significance of the Study</w:t>
+      </w:r>
+    </w:p>
+    <w:p>
+      <w:pPr>
+        <w:pStyle w:val="FirstParagraph"/>
+      </w:pPr>
+      <w:r>
+        <w:t>This section explains the academic, practical, societal, and future-research value of the proposed AI-powered moderation module.</w:t>
       </w:r>
     </w:p>
     <w:p>
@@ -779,23 +773,31 @@
         <w:pStyle w:val="Heading3"/>
       </w:pPr>
       <w:r>
-        <w:t xml:space="preserve">1.5.1 Academic Contribution</w:t>
-      </w:r>
-    </w:p>
-    <w:p>
-      <w:pPr>
-        <w:pStyle w:val="FirstParagraph"/>
-      </w:pPr>
-      <w:r>
-        <w:t xml:space="preserve">This research contributes a controlled evaluation of temporal aggregation for an imbalanced, author-derived conversation endpoint. Its principal result is not merely that an LSTM produces a strong score, but that the seven-feature LSTM outperforms a validation-fitted weighted scorer supplied with the same seven inputs. This matched comparison provides direct evidence that recurrent sequence modeling adds predictive value beyond static combination of the engineered trajectory features.</w:t>
-      </w:r>
-    </w:p>
-    <w:p>
-      <w:pPr>
-        <w:pStyle w:val="BodyText"/>
-      </w:pPr>
-      <w:r>
-        <w:t xml:space="preserve">The study also contributes a reproducible evaluation design for conversational safety research: connected-author partitions; training-only construction of the benign centroid and keyword lexicon; validation-only selection of checkpoints, model configurations, feature thresholds, scorer weights, and operating thresholds; a single held-out final comparison; and component-grouped uncertainty estimates. These controls address a common but consequential source of overstatement in conversation datasets, where the same participant can otherwise appear across multiple splits.</w:t>
+        <w:t>1.5.1 Academic Contribution</w:t>
+      </w:r>
+    </w:p>
+    <w:p>
+      <w:pPr>
+        <w:pStyle w:val="FirstParagraph"/>
+      </w:pPr>
+      <w:r>
+        <w:t>This research contributes to computer science, artificial intelligence, cybersecurity, and online-safety research by demonstrating how contextual natural language processing can be integrated with behavioral trajectory analysis in a complete moderation architecture. Rather than reducing an interaction to isolated keywords or a single message score, the proposed system represents how evidence evolves across an ordered conversation.</w:t>
+      </w:r>
+    </w:p>
+    <w:p>
+      <w:pPr>
+        <w:pStyle w:val="FirstParagraph"/>
+      </w:pPr>
+      <w:r>
+        <w:t>The study contributes a two-layer design consisting of a context-conditioned DistilBERT classifier, seven interpretable trajectory features, and recurrent LSTM aggregation. The matched comparison between the seven-feature LSTM and a weighted scorer receiving the same information provides direct empirical evidence that learned sequence modeling adds predictive value beyond static feature combination. The primary LSTM's improvements in recall and false-negative reduction also address the study's central safety-oriented performance objective.</w:t>
+      </w:r>
+    </w:p>
+    <w:p>
+      <w:pPr>
+        <w:pStyle w:val="FirstParagraph"/>
+      </w:pPr>
+      <w:r>
+        <w:t>The research additionally contributes a reproducible evaluation framework for conversational data: connected-author partitioning, training-only construction of derived resources, validation-only model and threshold selection, a locked final test, and component-grouped uncertainty estimation. These controls strengthen the reliability of the reported findings and provide a foundation for future studies of contextual and behavioral moderation.</w:t>
       </w:r>
     </w:p>
     <w:p>
@@ -803,23 +805,31 @@
         <w:pStyle w:val="Heading3"/>
       </w:pPr>
       <w:r>
-        <w:t xml:space="preserve">1.5.2 Industry and Practical Applications</w:t>
-      </w:r>
-    </w:p>
-    <w:p>
-      <w:pPr>
-        <w:pStyle w:val="FirstParagraph"/>
-      </w:pPr>
-      <w:r>
-        <w:t xml:space="preserve">For platform and moderation researchers, the prototype demonstrates a practical architecture for combining contextual language modeling with an auditable sequence representation. The seven-feature recurrent head is compact, its input signals can be inspected over time, and its output is intended to prioritize conversations for human review. These properties make the design a credible candidate for later platform-specific validation and integration research.</w:t>
-      </w:r>
-    </w:p>
-    <w:p>
-      <w:pPr>
-        <w:pStyle w:val="BodyText"/>
-      </w:pPr>
-      <w:r>
-        <w:t xml:space="preserve">The present evidence supports offline decision assistance rather than autonomous action. Any operational deployment would require representative platform data, calibration, privacy and fairness review, throughput measurement, and a clearly defined human escalation process.</w:t>
+        <w:t>1.5.2 Industry and Practical Applications</w:t>
+      </w:r>
+    </w:p>
+    <w:p>
+      <w:pPr>
+        <w:pStyle w:val="FirstParagraph"/>
+      </w:pPr>
+      <w:r>
+        <w:t>For chat platforms, gaming communities, social networks, and collaborative systems, the research demonstrates a practical architecture for augmenting existing moderation workflows. The module combines contextual language processing with an auditable sequence representation, allowing its trajectory features and conversation scores to be inspected rather than functioning only as an opaque end-to-end decision.</w:t>
+      </w:r>
+    </w:p>
+    <w:p>
+      <w:pPr>
+        <w:pStyle w:val="FirstParagraph"/>
+      </w:pPr>
+      <w:r>
+        <w:t>The approach is particularly relevant to human-review workflows in which limited moderation resources must be directed toward conversations most likely to require attention. Its modular design allows keyword rules, contextual classifiers, trajectory models, and human escalation policies to operate as complementary safeguards rather than mutually exclusive alternatives.</w:t>
+      </w:r>
+    </w:p>
+    <w:p>
+      <w:pPr>
+        <w:pStyle w:val="FirstParagraph"/>
+      </w:pPr>
+      <w:r>
+        <w:t>The completed prototype establishes technical feasibility in controlled offline evaluation. Adaptation to a specific platform would still require representative local data, calibration, privacy and fairness assessment, performance engineering, and evaluation with actual moderators; these are deployment requirements rather than limitations on the architectural contribution demonstrated here.</w:t>
       </w:r>
     </w:p>
     <w:p>
@@ -827,31 +837,31 @@
         <w:pStyle w:val="Heading3"/>
       </w:pPr>
       <w:r>
-        <w:t xml:space="preserve">1.5.3 Societal Benefits</w:t>
-      </w:r>
-    </w:p>
-    <w:p>
-      <w:pPr>
-        <w:pStyle w:val="FirstParagraph"/>
-      </w:pPr>
-      <w:r>
-        <w:t xml:space="preserve">Beyond academia and industry, this research has potential societal value. Online harassment and grooming pose serious threats to user well-being, particularly for children, adolescents, and individuals with limited digital literacy. The present study contributes an experimentally evaluated screening architecture that future platform-specific research can adapt for human-reviewed digital-safety workflows. Its PAN12 results do not by themselves demonstrate prevention of real-world harm, but they provide evidence for a more effective way to prioritize conversations under the study’s endpoint.</w:t>
-      </w:r>
-    </w:p>
-    <w:p>
-      <w:pPr>
-        <w:pStyle w:val="BodyText"/>
-      </w:pPr>
-      <w:r>
-        <w:t xml:space="preserve">In the Philippine context, the study is relevant to continuing efforts to protect young people who participate in online gaming, social media, and digital communication platforms. The research offers a prototype and an evaluation approach that local platform administrators and digital-safety researchers may build upon. It does not, however, claim Philippine-specific or Filipino/Taglish model validation; that requires representative local data and separate evaluation.</w:t>
-      </w:r>
-    </w:p>
-    <w:p>
-      <w:pPr>
-        <w:pStyle w:val="BodyText"/>
-      </w:pPr>
-      <w:r>
-        <w:t xml:space="preserve">The work provides a foundation that organizations with limited moderation resources may evaluate and adapt, subject to representative data, governance, and human-review safeguards.</w:t>
+        <w:t>1.5.3 Societal Benefits</w:t>
+      </w:r>
+    </w:p>
+    <w:p>
+      <w:pPr>
+        <w:pStyle w:val="FirstParagraph"/>
+      </w:pPr>
+      <w:r>
+        <w:t>Online grooming and related forms of exploitation pose serious threats to user well-being, particularly for children, adolescents, and users with limited digital literacy. By improving the ability of a moderation system to identify conversations missed by static keyword rules, this study contributes to the development of more responsive digital-safety tools.</w:t>
+      </w:r>
+    </w:p>
+    <w:p>
+      <w:pPr>
+        <w:pStyle w:val="FirstParagraph"/>
+      </w:pPr>
+      <w:r>
+        <w:t>The proposed module is not presented as an autonomous judge or as proof of real-world harm prevention. Its societal value lies in strengthening the technical basis for human-reviewed detection, increasing attention to false negatives, and supporting future platform-specific systems that can intervene more consistently in concerning interactions.</w:t>
+      </w:r>
+    </w:p>
+    <w:p>
+      <w:pPr>
+        <w:pStyle w:val="FirstParagraph"/>
+      </w:pPr>
+      <w:r>
+        <w:t>The architecture and evaluation process can also provide a starting point for organizations with limited moderation resources, provided that any adaptation is accompanied by appropriate governance, representative data, and qualified human oversight.</w:t>
       </w:r>
     </w:p>
     <w:p>
@@ -859,31 +869,31 @@
         <w:pStyle w:val="Heading3"/>
       </w:pPr>
       <w:r>
-        <w:t xml:space="preserve">1.5.4 Implications for Future Research</w:t>
-      </w:r>
-    </w:p>
-    <w:p>
-      <w:pPr>
-        <w:pStyle w:val="FirstParagraph"/>
-      </w:pPr>
-      <w:r>
-        <w:t xml:space="preserve">This research establishes a foundation for future investigations into AI-powered moderation systems and behavioral analysis in digital communication. The methodologies, datasets, and frameworks developed in this study can be extended to detect other forms of harmful communication, including hate speech, misinformation, and cyberbullying. The techniques presented can be adapted for other communication platforms beyond chat systems, such as email, messaging applications, forums, and social media.</w:t>
-      </w:r>
-    </w:p>
-    <w:p>
-      <w:pPr>
-        <w:pStyle w:val="BodyText"/>
-      </w:pPr>
-      <w:r>
-        <w:t xml:space="preserve">Additionally, this work opens avenues for research into more sophisticated machine learning models, including deep learning approaches and transfer learning techniques, that could further improve detection accuracy. Future research can also explore the integration of multimodal analysis (text, images, video) for comprehensive content moderation.</w:t>
-      </w:r>
-    </w:p>
-    <w:p>
-      <w:pPr>
-        <w:pStyle w:val="BodyText"/>
-      </w:pPr>
-      <w:r>
-        <w:t xml:space="preserve">The study also highlights the importance of addressing challenges such as linguistic diversity, cultural context, and adversarial evasion techniques, which present opportunities for continued research and innovation in the field.</w:t>
+        <w:t>1.5.4 Implications for Future Research</w:t>
+      </w:r>
+    </w:p>
+    <w:p>
+      <w:pPr>
+        <w:pStyle w:val="FirstParagraph"/>
+      </w:pPr>
+      <w:r>
+        <w:t>This research establishes a foundation for future investigations into AI-powered moderation systems and behavioral analysis in digital communication. The methodologies, datasets, and frameworks developed in this study can be extended to detect other forms of harmful communication, including hate speech, misinformation, and cyberbullying. The techniques presented can be adapted for other communication platforms beyond chat systems, such as email, messaging applications, forums, and social media.</w:t>
+      </w:r>
+    </w:p>
+    <w:p>
+      <w:pPr>
+        <w:pStyle w:val="FirstParagraph"/>
+      </w:pPr>
+      <w:r>
+        <w:t>Additionally, this work opens avenues for research into more sophisticated machine learning models, including deep learning approaches and transfer learning techniques, that could further improve detection accuracy. Future research can also explore the integration of multimodal analysis (text, images, video) for comprehensive content moderation.</w:t>
+      </w:r>
+    </w:p>
+    <w:p>
+      <w:pPr>
+        <w:pStyle w:val="FirstParagraph"/>
+      </w:pPr>
+      <w:r>
+        <w:t>The study also highlights the importance of addressing challenges such as linguistic diversity, cultural context, and adversarial evasion techniques, which present opportunities for continued research and innovation in the field.</w:t>
       </w:r>
     </w:p>
     <w:p>
@@ -891,15 +901,15 @@
         <w:pStyle w:val="Heading3"/>
       </w:pPr>
       <w:r>
-        <w:t xml:space="preserve">1.5.5 Sustainable Development Goal (SDG) Contribution</w:t>
-      </w:r>
-    </w:p>
-    <w:p>
-      <w:pPr>
-        <w:pStyle w:val="FirstParagraph"/>
-      </w:pPr>
-      <w:r>
-        <w:t xml:space="preserve">This study supports Sustainable Development Goal 9 (Industry, Innovation and Infrastructure) through the development of an AI-driven moderation prototype that applies machine learning and natural language processing to contextual conversation analysis. It also supports Sustainable Development Goal 16 (Peace, Justice and Strong Institutions) by contributing a reproducible, human-review-oriented method for prioritizing PAN12 conversations associated with listed predator authors. The study establishes this contribution on its defined benchmark endpoint while reserving real-platform safety effects for later external validation.</w:t>
+        <w:t>1.5.5 Sustainable Development Goal (SDG) Contribution</w:t>
+      </w:r>
+    </w:p>
+    <w:p>
+      <w:pPr>
+        <w:pStyle w:val="FirstParagraph"/>
+      </w:pPr>
+      <w:r>
+        <w:t>This study supports Sustainable Development Goal 9 (Industry, Innovation and Infrastructure) through the development of an AI-driven moderation prototype that combines machine learning, natural language processing, and behavioral trajectory analysis to advance digital-safety infrastructure. It also supports Sustainable Development Goal 16 (Peace, Justice and Strong Institutions) by contributing a reproducible method for improving the identification and human review of potentially harmful online interactions. The study's empirical claims are bounded to its PAN12 evaluation, while its architectural and methodological contributions provide a basis for broader future adaptation.</w:t>
       </w:r>
     </w:p>
     <w:p>
@@ -907,103 +917,119 @@
         <w:pStyle w:val="Heading2"/>
       </w:pPr>
       <w:r>
-        <w:t xml:space="preserve">1.6 Definition of Terms</w:t>
-      </w:r>
-    </w:p>
-    <w:p>
-      <w:pPr>
-        <w:pStyle w:val="FirstParagraph"/>
-      </w:pPr>
-      <w:r>
-        <w:t xml:space="preserve">Artificial Intelligence (AI) - The development and application of computer systems designed to perform tasks that typically require human intelligence, including learning from experience, recognizing patterns, and making decisions.</w:t>
-      </w:r>
-    </w:p>
-    <w:p>
-      <w:pPr>
-        <w:pStyle w:val="BodyText"/>
-      </w:pPr>
-      <w:r>
-        <w:t xml:space="preserve">Behavioral Pattern Analysis - A technique that examines sequences and trends in user interactions over time to identify recurring behaviors, including suspicious or harmful activity patterns.</w:t>
-      </w:r>
-    </w:p>
-    <w:p>
-      <w:pPr>
-        <w:pStyle w:val="BodyText"/>
-      </w:pPr>
-      <w:r>
-        <w:t xml:space="preserve">Chat Moderation System - An automated or semi-automated system designed to monitor, filter, and regulate user communications in real-time chat environments to prevent harmful interactions.</w:t>
-      </w:r>
-    </w:p>
-    <w:p>
-      <w:pPr>
-        <w:pStyle w:val="BodyText"/>
-      </w:pPr>
-      <w:r>
-        <w:t xml:space="preserve">Contextual Analysis - The examination of messages or interactions within their broader communicative context, considering surrounding messages, conversation history, and conversational intent rather than analyzing content in isolation.</w:t>
-      </w:r>
-    </w:p>
-    <w:p>
-      <w:pPr>
-        <w:pStyle w:val="BodyText"/>
-      </w:pPr>
-      <w:r>
-        <w:t xml:space="preserve">Grooming - A manipulative process in which a malicious user gradually builds trust with a target, typically a minor, to lower their defenses and facilitate exploitation or abuse.</w:t>
-      </w:r>
-    </w:p>
-    <w:p>
-      <w:pPr>
-        <w:pStyle w:val="BodyText"/>
-      </w:pPr>
-      <w:r>
-        <w:t xml:space="preserve">Machine Learning - A subset of artificial intelligence that enables computer systems to learn patterns from data and improve their performance without being explicitly programmed for every specific task.</w:t>
-      </w:r>
-    </w:p>
-    <w:p>
-      <w:pPr>
-        <w:pStyle w:val="BodyText"/>
-      </w:pPr>
-      <w:r>
-        <w:t xml:space="preserve">Natural Language Processing (NLP) - A field of artificial intelligence that focuses on enabling computers to understand, interpret, and generate human language in a meaningful and contextually relevant manner.</w:t>
-      </w:r>
-    </w:p>
-    <w:p>
-      <w:pPr>
-        <w:pStyle w:val="BodyText"/>
-      </w:pPr>
-      <w:r>
-        <w:t xml:space="preserve">Obfuscation Techniques - Methods used to conceal or disguise harmful content, such as altered spellings, special characters, coded language, or other modifications designed to bypass keyword-based filters.</w:t>
-      </w:r>
-    </w:p>
-    <w:p>
-      <w:pPr>
-        <w:pStyle w:val="BodyText"/>
-      </w:pPr>
-      <w:r>
-        <w:t xml:space="preserve">Online Grooming Discourse Model (OGDM) - The theoretical lens used to motivate analysis of grooming as a non-linear, cross-turn discourse process. In this study it informs the sequence-modeling rationale; it is not treated as a source of verified message-stage labels.</w:t>
-      </w:r>
-    </w:p>
-    <w:p>
-      <w:pPr>
-        <w:pStyle w:val="BodyText"/>
-      </w:pPr>
-      <w:r>
-        <w:t xml:space="preserve">Predatory Behavior - Actions or communication patterns intended to exploit, manipulate, or harm other users, particularly targeting vulnerable individuals.</w:t>
-      </w:r>
-    </w:p>
-    <w:p>
-      <w:pPr>
-        <w:pStyle w:val="BodyText"/>
-      </w:pPr>
-      <w:r>
-        <w:t xml:space="preserve">Offline Sequential Replay - The controlled processing of stored or locally entered messages in chronological order to simulate turn-by-turn analysis. It does not constitute a live platform deployment or establish production latency, scalability, or integration performance.</w:t>
-      </w:r>
-    </w:p>
-    <w:p>
-      <w:pPr>
-        <w:pStyle w:val="BodyText"/>
-      </w:pPr>
-      <w:r>
-        <w:t xml:space="preserve">User Reporting Mechanism - A system feature that allows chat platform users to report suspicious, harmful, or policy-violating behavior to moderators or automated systems for review and action.</w:t>
+        <w:t>1.6 Definition of Terms</w:t>
+      </w:r>
+    </w:p>
+    <w:p>
+      <w:pPr>
+        <w:pStyle w:val="FirstParagraph"/>
+      </w:pPr>
+      <w:r>
+        <w:t>Artificial Intelligence (AI) - The development and application of computer systems designed to perform tasks that typically require human intelligence, including learning from experience, recognizing patterns, and making decisions.</w:t>
+      </w:r>
+    </w:p>
+    <w:p>
+      <w:pPr>
+        <w:pStyle w:val="FirstParagraph"/>
+      </w:pPr>
+      <w:r>
+        <w:t>Behavioral Pattern Analysis - A technique that examines sequences and trends in user interactions over time to identify recurring behaviors, including suspicious or harmful activity patterns.</w:t>
+      </w:r>
+    </w:p>
+    <w:p>
+      <w:pPr>
+        <w:pStyle w:val="FirstParagraph"/>
+      </w:pPr>
+      <w:r>
+        <w:t>Chat Moderation System - An automated or semi-automated system designed to monitor, prioritize, filter, or regulate user communications in chat environments to reduce harmful interactions and support moderator action.</w:t>
+      </w:r>
+    </w:p>
+    <w:p>
+      <w:pPr>
+        <w:pStyle w:val="FirstParagraph"/>
+      </w:pPr>
+      <w:r>
+        <w:t>Contextual Analysis - The examination of messages or interactions within their broader communicative context, considering surrounding messages, conversation history, and conversational intent rather than analyzing content in isolation.</w:t>
+      </w:r>
+    </w:p>
+    <w:p>
+      <w:pPr>
+        <w:pStyle w:val="FirstParagraph"/>
+      </w:pPr>
+      <w:r>
+        <w:t>Conversation-Level Endpoint - The primary measurable outcome used in the experiment: whether a dyadic PAN12 conversation contains at least one author included in the official predator-author list.</w:t>
+      </w:r>
+    </w:p>
+    <w:p>
+      <w:pPr>
+        <w:pStyle w:val="FirstParagraph"/>
+      </w:pPr>
+      <w:r>
+        <w:t>Grooming - A manipulative process in which a malicious user gradually builds trust with a target, typically a minor, to lower the target's defenses and facilitate exploitation or abuse.</w:t>
+      </w:r>
+    </w:p>
+    <w:p>
+      <w:pPr>
+        <w:pStyle w:val="FirstParagraph"/>
+      </w:pPr>
+      <w:r>
+        <w:t>Machine Learning - A subset of artificial intelligence that enables computer systems to learn patterns from data and improve their performance without being explicitly programmed for every specific task.</w:t>
+      </w:r>
+    </w:p>
+    <w:p>
+      <w:pPr>
+        <w:pStyle w:val="FirstParagraph"/>
+      </w:pPr>
+      <w:r>
+        <w:t>Natural Language Processing (NLP) - A field of artificial intelligence that focuses on enabling computers to understand, interpret, and generate human language in a meaningful and contextually relevant manner.</w:t>
+      </w:r>
+    </w:p>
+    <w:p>
+      <w:pPr>
+        <w:pStyle w:val="FirstParagraph"/>
+      </w:pPr>
+      <w:r>
+        <w:t>Obfuscation Techniques - Methods used to conceal or disguise harmful content, such as altered spellings, special characters, coded language, or other modifications designed to bypass keyword-based filters.</w:t>
+      </w:r>
+    </w:p>
+    <w:p>
+      <w:pPr>
+        <w:pStyle w:val="FirstParagraph"/>
+      </w:pPr>
+      <w:r>
+        <w:t>Online Grooming Discourse Model (OGDM) - The principal theoretical framework used to understand grooming as a non-linear network of communicative processes, including deceptive trust development, sexual gratification, compliance testing, and isolation. In this study, OGDM informs the rationale and hypotheses behind cross-turn trajectory analysis; the implemented features are theoretically informed indicators rather than independently validated OGDM-stage labels.</w:t>
+      </w:r>
+    </w:p>
+    <w:p>
+      <w:pPr>
+        <w:pStyle w:val="FirstParagraph"/>
+      </w:pPr>
+      <w:r>
+        <w:t>Predator-Author Proxy Score - The Layer 1 output learned from official predator-author membership under the available message context. It is an intermediate signal for conversation modeling and is not treated as a validated probability that an individual message contains grooming behavior.</w:t>
+      </w:r>
+    </w:p>
+    <w:p>
+      <w:pPr>
+        <w:pStyle w:val="FirstParagraph"/>
+      </w:pPr>
+      <w:r>
+        <w:t>Predatory Behavior - Actions or communication patterns intended to exploit, manipulate, or harm other users, particularly targeting vulnerable individuals.</w:t>
+      </w:r>
+    </w:p>
+    <w:p>
+      <w:pPr>
+        <w:pStyle w:val="FirstParagraph"/>
+      </w:pPr>
+      <w:r>
+        <w:t>Offline Sequential Replay - The controlled processing of stored or locally entered messages in chronological order to simulate turn-by-turn analysis. It does not constitute a live platform deployment or establish production latency, scalability, or integration performance.</w:t>
+      </w:r>
+    </w:p>
+    <w:p>
+      <w:pPr>
+        <w:pStyle w:val="FirstParagraph"/>
+      </w:pPr>
+      <w:r>
+        <w:t>User Reporting Mechanism - A system feature that allows chat-platform users to report suspicious, harmful, or policy-violating behavior to moderators or automated systems for review and action.</w:t>
       </w:r>
     </w:p>
     <w:p>
@@ -1028,194 +1054,181 @@
         </w:rPr>
       </w:pPr>
       <w:r>
+        <w:t>II. RELATED WORK</w:t>
+      </w:r>
+    </w:p>
+    <w:p>
+      <w:pPr>
+        <w:pStyle w:val="FirstParagraph"/>
+      </w:pPr>
+      <w:r>
+        <w:t>This chapter reviews and synthesizes literature and empirical studies concerning AI-based chat moderation, online grooming detection, contextual natural language processing, and behavioral analysis. It examines why isolated keywords and individual messages are insufficient for interactions whose meaning and risk emerge over multiple turns.</w:t>
+      </w:r>
+    </w:p>
+    <w:p>
+      <w:pPr>
+        <w:pStyle w:val="FirstParagraph"/>
+      </w:pPr>
+      <w:r>
+        <w:t>The chapter establishes the scholarly and theoretical foundation for the proposed two-layer moderation module. It connects contextual transformer modeling, behavioral-feature research, sequence learning, and the Online Grooming Discourse Model to the study's design, while distinguishing that broader research foundation from the author-derived PAN12 endpoint used for empirical evaluation.</w:t>
+      </w:r>
+    </w:p>
+    <w:p>
+      <w:pPr>
+        <w:pStyle w:val="Heading2"/>
+      </w:pPr>
+      <w:r>
+        <w:t>2.1 Review of Related Literature</w:t>
+      </w:r>
+    </w:p>
+    <w:p>
+      <w:pPr>
+        <w:pStyle w:val="FirstParagraph"/>
+      </w:pPr>
+      <w:r>
+        <w:t>Recent research in chat moderation has shifted from traditional rule-based filtering toward AI-driven contextual analysis models. Earlier moderation approaches relied primarily on keyword blacklists to detect violations such as profanity or explicit harmful language. However, these systems are limited in their ability to interpret conversational intent, allowing malicious users to bypass filters through techniques such as altered spellings, coded language, or multi-message grooming strategies.</w:t>
+      </w:r>
+    </w:p>
+    <w:p>
+      <w:pPr>
+        <w:pStyle w:val="FirstParagraph"/>
+      </w:pPr>
+      <w:r>
+        <w:t>Modern studies emphasize the importance of contextual understanding in detecting harmful user behavior. Schurger-Foy et al. [9] demonstrated that approximately 67% of toxic messages in multiplayer gaming environments are context dependent, meaning that they appear harmless when analyzed as isolated text but become problematic when examined within conversational history. Similarly, Yang et al. [6] introduced the ToxBuster architecture, which incorporates message history and speaker metadata into text classification models. Their results showed significant improvements in detection accuracy, achieving up to 95% precision in identifying harmful interactions through sequence-based moderation rather than single message evaluation.</w:t>
+      </w:r>
+    </w:p>
+    <w:p>
+      <w:pPr>
+        <w:pStyle w:val="FirstParagraph"/>
+      </w:pPr>
+      <w:r>
+        <w:t>These findings suggest that integrating conversational context and historical behavioral patterns improves moderation effectiveness compared to static filtering methods. Transformer-based NLP architectures such as BERT, RoBERTa, and DistilBERT have consequently emerged as standard tools for understanding linguistic patterns in chat environments.</w:t>
+      </w:r>
+    </w:p>
+    <w:p>
+      <w:pPr>
+        <w:pStyle w:val="FirstParagraph"/>
+      </w:pPr>
+      <w:r>
+        <w:t>Furthermore, longitudinal behavioral analysis has been shown to be a strong predictive indicator of future harmful activity. Studies indicate that tracking interaction patterns over time can achieve up to 74% balanced accuracy in forecasting future toxic behavior, reinforcing the importance of behavioral modeling in proactive moderation systems.</w:t>
+      </w:r>
+    </w:p>
+    <w:p>
+      <w:pPr>
+        <w:pStyle w:val="FirstParagraph"/>
+      </w:pPr>
+      <w:r>
+        <w:t>Despite these advancements, current moderation systems remain constrained by their reliance on legacy datasets such as PAN12, which may not adequately represent modern online communication styles, slang, or evolving evasion techniques used by malicious actors.</w:t>
+      </w:r>
+    </w:p>
+    <w:p>
+      <w:pPr>
+        <w:pStyle w:val="Heading2"/>
+      </w:pPr>
+      <w:r>
+        <w:t>2.2 Related Studies</w:t>
+      </w:r>
+    </w:p>
+    <w:p>
+      <w:pPr>
+        <w:pStyle w:val="FirstParagraph"/>
+      </w:pPr>
+      <w:r>
+        <w:t>Several empirical studies have explored the application of artificial intelligence to grooming-related interactions and other context-dependent harms in online environments.</w:t>
+      </w:r>
+    </w:p>
+    <w:p>
+      <w:pPr>
+        <w:pStyle w:val="FirstParagraph"/>
+      </w:pPr>
+      <w:r>
+        <w:t>The empirical study of automated grooming detection is anchored in the PAN-2012 Sexual Predator Identification task introduced by Inches and Crestani [13]. PAN12 defined two related tasks: identifying predators among conversation participants and identifying lines considered most characteristic of predatory behavior. The present study uses the official predator-author list as its verified source of supervision and derives a conversation-level endpoint from author presence. The separate distinctive-line task is not treated as an exhaustive set of grooming-message labels for the training conversations used here.</w:t>
+      </w:r>
+    </w:p>
+    <w:p>
+      <w:pPr>
+        <w:pStyle w:val="FirstParagraph"/>
+      </w:pPr>
+      <w:r>
+        <w:t>PAN12 is particularly valuable to the present research because its scale, chronological message order, and persistent speaker identifiers support both trajectory construction and connected-author evaluation. These properties allow the study to examine behavioral progression across turns while testing generalization to conversations involving unseen authors.</w:t>
+      </w:r>
+    </w:p>
+    <w:p>
+      <w:pPr>
+        <w:pStyle w:val="FirstParagraph"/>
+      </w:pPr>
+      <w:r>
+        <w:t>Building on the benchmark, Villatoro-Tello et al. [14] proposed a two-step approach that first separates predatory from non-predatory participants and then identifies the most suspicious users. Their method combines content-based evidence with behavioral features such as the proportion and pattern of a user's interventions. Its strong PAN12 performance demonstrates that participation and interaction structure, not message content alone, carry discriminative signal for predator identification. This finding directly motivates the proposed combination of contextual language analysis and behavioral trajectory features.</w:t>
+      </w:r>
+    </w:p>
+    <w:p>
+      <w:pPr>
+        <w:pStyle w:val="FirstParagraph"/>
+      </w:pPr>
+      <w:r>
+        <w:t>Street et al. [2] developed a transformer-based classification approach using BERT and RoBERTa to identify online grooming interactions by analyzing conversational roles between adults and minors. Their contextual determination framework improved cross-dataset robustness in identifying suspicious communication patterns across multiplayer gaming chats.</w:t>
+      </w:r>
+    </w:p>
+    <w:p>
+      <w:pPr>
+        <w:pStyle w:val="FirstParagraph"/>
+      </w:pPr>
+      <w:r>
+        <w:t xml:space="preserve">Faraz et al. [3] proposed </w:t>
+      </w:r>
+      <w:r>
         <w:rPr>
-          <w:rFonts w:asciiTheme="minorHAnsi" w:hAnsiTheme="minorHAnsi"/>
-          <w:color w:val="auto"/>
+          <w:b w:val="0"/>
+          <w:i/>
         </w:rPr>
-        <w:t>II. RELATED WORK</w:t>
-      </w:r>
-    </w:p>
-    <w:p>
-      <w:pPr>
-        <w:pStyle w:val="FirstParagraph"/>
-      </w:pPr>
-      <w:r>
-        <w:t xml:space="preserve">This chapter presents a review and synthesis of existing literature and empirical studies related to AI-based chat moderation and the detection of harmful interactions in online communication environments. The discussion focuses on recent developments in natural language processing (NLP), machine learning-based moderation frameworks, and behavioral analysis techniques used to identify grooming-related interactions and other context-dependent harmful communication patterns.</w:t>
-      </w:r>
-    </w:p>
-    <w:p>
-      <w:pPr>
-        <w:pStyle w:val="BodyText"/>
-      </w:pPr>
-      <w:r>
-        <w:t xml:space="preserve">The purpose of this chapter is to establish the scholarly foundation of the study, examine current moderation approaches and methodologies, and identify research gaps that justify the development of a behavioral and context-aware prototype for conversation-level safety screening.</w:t>
-      </w:r>
-    </w:p>
-    <w:p>
-      <w:pPr>
-        <w:pStyle w:val="Heading2"/>
-      </w:pPr>
-      <w:r>
-        <w:t xml:space="preserve">2.1 Review of Related Literature</w:t>
-      </w:r>
-    </w:p>
-    <w:p>
-      <w:pPr>
-        <w:pStyle w:val="FirstParagraph"/>
-      </w:pPr>
-      <w:r>
-        <w:t xml:space="preserve">Recent research in chat moderation has shifted from traditional rule-based filtering toward AI-driven contextual analysis models. Earlier moderation approaches relied primarily on keyword blacklists to detect violations such as profanity or explicit harmful language. However, these systems are limited in their ability to interpret conversational intent, allowing malicious users to bypass filters through techniques such as altered spellings, coded language, or multi-message grooming strategies.</w:t>
-      </w:r>
-    </w:p>
-    <w:p>
-      <w:pPr>
-        <w:pStyle w:val="BodyText"/>
-      </w:pPr>
-      <w:r>
-        <w:t xml:space="preserve">Modern studies emphasize the importance of contextual understanding in detecting harmful user behavior. Schurger-Foy et al. [9] demonstrated that approximately 67% of toxic messages in multiplayer gaming environments are context dependent, meaning that they appear harmless when analyzed as isolated text but become problematic when examined within conversational history. Similarly, Yang et al. [6] introduced the ToxBuster architecture, which incorporates message history and speaker metadata into text classification models. Their results showed significant improvements in detection accuracy, achieving up to 95% precision in identifying harmful interactions through sequence-based moderation rather than single message evaluation.</w:t>
-      </w:r>
-    </w:p>
-    <w:p>
-      <w:pPr>
-        <w:pStyle w:val="BodyText"/>
-      </w:pPr>
-      <w:r>
-        <w:t xml:space="preserve">These findings suggest that integrating conversational context and historical behavioral patterns improves moderation effectiveness compared to static filtering methods. Transformer-based NLP architectures such as BERT, RoBERTa, and DistilBERT have consequently emerged as standard tools for understanding linguistic patterns in chat environments.</w:t>
-      </w:r>
-    </w:p>
-    <w:p>
-      <w:pPr>
-        <w:pStyle w:val="BodyText"/>
-      </w:pPr>
-      <w:r>
-        <w:t xml:space="preserve">Furthermore, longitudinal behavioral analysis has been shown to be a strong predictive indicator of future harmful activity. Studies indicate that tracking interaction patterns over time can achieve up to 74% balanced accuracy in forecasting future toxic behavior, reinforcing the importance of behavioral modeling in proactive moderation systems.</w:t>
-      </w:r>
-    </w:p>
-    <w:p>
-      <w:pPr>
-        <w:pStyle w:val="BodyText"/>
-      </w:pPr>
-      <w:r>
-        <w:t xml:space="preserve">Despite these advancements, current moderation systems remain constrained by their reliance on legacy datasets such as PAN12, which may not adequately represent modern online communication styles, slang, or evolving evasion techniques used by malicious actors.</w:t>
-      </w:r>
-    </w:p>
-    <w:p>
-      <w:pPr>
-        <w:pStyle w:val="Heading2"/>
-      </w:pPr>
-      <w:r>
-        <w:t xml:space="preserve">2.2 Related Studies</w:t>
-      </w:r>
-    </w:p>
-    <w:p>
-      <w:pPr>
-        <w:pStyle w:val="FirstParagraph"/>
-      </w:pPr>
-      <w:r>
-        <w:t xml:space="preserve">Several empirical studies have explored the application of artificial intelligence in detecting grooming-related interactions within online environments.</w:t>
-      </w:r>
-    </w:p>
-    <w:p>
-      <w:pPr>
-        <w:pStyle w:val="BodyText"/>
-      </w:pPr>
-      <w:r>
-        <w:t xml:space="preserve">The empirical study of automated grooming detection is anchored in the PAN-2012 Sexual Predator Identification task introduced by Inches and Crestani [13]. PAN12 defined separate author-identification and distinctive-line tasks. The present study adopts the official predator-author list as its verified supervision and derives a conversation endpoint from author presence; it does not reinterpret author membership as an exhaustive message-level grooming annotation.</w:t>
-      </w:r>
-    </w:p>
-    <w:p>
-      <w:pPr>
-        <w:pStyle w:val="BodyText"/>
-      </w:pPr>
-      <w:r>
-        <w:t xml:space="preserve">PAN12 is especially suitable for the present research question because its scale, chronological message order, and persistent speaker identifiers support trajectory construction and connected-author evaluation. These properties make it possible to test generalization to conversations involving unseen authors while preserving the sequential structure required by the LSTM. Author-derived labels are therefore used as weak supervision for an intermediate contextual proxy, while the final empirical claim remains at the conversation level.</w:t>
-      </w:r>
-    </w:p>
-    <w:p>
-      <w:pPr>
-        <w:pStyle w:val="BodyText"/>
-      </w:pPr>
-      <w:r>
-        <w:t xml:space="preserve">Building on this benchmark, Villatoro-Tello et al. [14] proposed a two-step approach that first separates predatory from non-predatory participants and then identifies the most suspicious users, combining content-based features with behavioral features such as the proportion and pattern of a user’s interventions within a conversation. Their system achieved the highest performance among the sixteen teams in the PAN-2012 competition, demonstrating that participation and interaction-pattern features—not message content alone—carry discriminative signal for predator detection. This finding directly motivates the use of behavioral trajectory features alongside context-conditioned turn-level proxy signals in the present study.</w:t>
-      </w:r>
-    </w:p>
-    <w:p>
-      <w:pPr>
-        <w:pStyle w:val="BodyText"/>
-      </w:pPr>
-      <w:r>
-        <w:t xml:space="preserve">Street et al. [2] developed a transformer-based classification approach using BERT and RoBERTa models to identify online grooming interactions by analyzing conversational roles between adults and minors. Their contextual determination framework improved cross-dataset robustness in identifying suspicious communication patterns across multiplayer gaming chats.</w:t>
-      </w:r>
-    </w:p>
-    <w:p>
-      <w:pPr>
-        <w:pStyle w:val="BodyText"/>
-      </w:pPr>
-      <w:r>
-        <w:t xml:space="preserve">Faraz et al. [3] proposed</w:t>
-      </w:r>
-      <w:r>
-        <w:t xml:space="preserve"> </w:t>
-      </w:r>
-      <w:r>
-        <w:rPr>
-          <w:i/>
-          <w:iCs/>
-        </w:rPr>
-        <w:t xml:space="preserve">Protectbot</w:t>
-      </w:r>
-      <w:r>
-        <w:t xml:space="preserve">, an AI-based chatbot that actively simulates user interaction to expose predatory intent. Utilizing the DialoGPT language model combined with intent classifiers such as fastText and Support Vector Machines, the system achieved an</w:t>
-      </w:r>
-      <w:r>
-        <w:t xml:space="preserve"> </w:t>
+        <w:t>Protectbot</w:t>
+      </w:r>
+      <w:r>
+        <w:t xml:space="preserve">, an AI-based chatbot that actively simulates user interaction to expose predatory intent. Using DialoGPT together with intent classifiers such as fastText and Support Vector Machines, the system reported an </w:t>
       </w:r>
       <w:r>
         <w:rPr>
           <w:b/>
-          <w:bCs/>
+          <w:i w:val="0"/>
         </w:rPr>
-        <w:t xml:space="preserve">F</w:t>
-      </w:r>
-      <w:r>
-        <w:t xml:space="preserve">-</w:t>
+        <w:t>F</w:t>
+      </w:r>
+      <w:r>
+        <w:t>-</w:t>
       </w:r>
       <w:r>
         <w:rPr>
           <w:b/>
-          <w:bCs/>
+          <w:i w:val="0"/>
         </w:rPr>
-        <w:t xml:space="preserve">score of 0.99</w:t>
-      </w:r>
-      <w:r>
-        <w:t xml:space="preserve"> </w:t>
-      </w:r>
-      <w:r>
-        <w:t xml:space="preserve">in detecting grooming behavior within simulated chat environments.</w:t>
-      </w:r>
-    </w:p>
-    <w:p>
-      <w:pPr>
-        <w:pStyle w:val="BodyText"/>
-      </w:pPr>
-      <w:r>
-        <w:t xml:space="preserve">Comparative evaluations conducted by Tereshchenko and Hämäläinen [5] revealed that lightweight transformer models such as DistilBERT provide an optimal balance between computational efficiency and moderation accuracy in high-volume chat systems. Their findings showed that while large generative language models offer improved linguistic nuance, they introduce latency issues that hinder real-time deployment in live environments.</w:t>
-      </w:r>
-    </w:p>
-    <w:p>
-      <w:pPr>
-        <w:pStyle w:val="BodyText"/>
-      </w:pPr>
-      <w:r>
-        <w:t xml:space="preserve">In addition, qualitative analyses of real-time moderation frameworks within child-centric platforms such as Roblox have highlighted sociotechnical challenges including algorithmic bias, cultural sensitivity issues, and limited transparency in automated decision-making processes.</w:t>
-      </w:r>
-    </w:p>
-    <w:p>
-      <w:pPr>
-        <w:pStyle w:val="BodyText"/>
-      </w:pPr>
-      <w:r>
-        <w:t xml:space="preserve">While these studies demonstrate the effectiveness of AI-based moderation tools, many approaches still analyze localized chat contexts or isolated messages. As a result, they may fail to model behavioral trajectories that evolve across multiple turns within a conversation.</w:t>
+        <w:t>score of 0.99</w:t>
+      </w:r>
+      <w:r>
+        <w:t xml:space="preserve"> for detecting grooming behavior in its simulated chat environment.</w:t>
+      </w:r>
+    </w:p>
+    <w:p>
+      <w:pPr>
+        <w:pStyle w:val="FirstParagraph"/>
+      </w:pPr>
+      <w:r>
+        <w:t>Tereshchenko and Hamalainen [5] compared language-model approaches for real-time moderation and highlighted the tradeoff between linguistic capability and computational cost. Their findings support the use of lightweight transformer architectures such as DistilBERT when contextual analysis must remain computationally manageable.</w:t>
+      </w:r>
+    </w:p>
+    <w:p>
+      <w:pPr>
+        <w:pStyle w:val="FirstParagraph"/>
+      </w:pPr>
+      <w:r>
+        <w:t>Research on child-centered platforms also emphasizes that automated moderation is a sociotechnical problem involving algorithmic bias, cultural sensitivity, transparency, and the continuing need for human judgment. These concerns reinforce the study's use of AI as a review-support mechanism rather than an autonomous enforcement authority.</w:t>
+      </w:r>
+    </w:p>
+    <w:p>
+      <w:pPr>
+        <w:pStyle w:val="FirstParagraph"/>
+      </w:pPr>
+      <w:r>
+        <w:t>Collectively, the related studies demonstrate the value of contextual language models and behavioral evidence. However, many approaches still emphasize localized context, isolated classification decisions, or static feature aggregation. This leaves an important research opportunity: modeling how contextual and behavioral evidence evolves across the full trajectory of a conversation.</w:t>
       </w:r>
     </w:p>
     <w:p>
@@ -1223,90 +1236,90 @@
         <w:pStyle w:val="Heading2"/>
       </w:pPr>
       <w:r>
-        <w:t xml:space="preserve">2.3 Theoretical Background</w:t>
-      </w:r>
-    </w:p>
-    <w:p>
-      <w:pPr>
-        <w:pStyle w:val="FirstParagraph"/>
-      </w:pPr>
-      <w:r>
-        <w:t xml:space="preserve">The theoretical foundation of this study is based on advancements in machine learning-driven natural language processing and behavioral pattern recognition.</w:t>
-      </w:r>
-    </w:p>
-    <w:p>
-      <w:pPr>
-        <w:pStyle w:val="BodyText"/>
-      </w:pPr>
-      <w:r>
-        <w:t xml:space="preserve">Beyond the computational literature, the detection task is grounded in discourse-analytic models of how grooming unfolds in conversation. O’Connell [12] provided one of the earliest typologies, describing online grooming as a progression through stages—friendship forming, relationship forming, risk assessment, exclusivity, and a sexual stage—in which an offender gradually escalates a relationship with a minor. While influential, this stage model assumes a largely linear progression that later empirical work has shown offenders do not consistently follow.</w:t>
-      </w:r>
-    </w:p>
-    <w:p>
-      <w:pPr>
-        <w:pStyle w:val="BodyText"/>
-      </w:pPr>
-      <w:r>
-        <w:t xml:space="preserve">The primary theoretical framework adopted in this study is the model of online grooming discourse developed by Lorenzo-Dus, Izura, and Pérez-Tattam [11]. Drawing on a large corpus of offender chat logs, their analysis characterizes grooming not as a fixed linear sequence but as an entrapment network realized through four interrelated communicative processes: deceptive trust development, sexual gratification, compliance testing, and isolation. Deceptive trust development—the discursive building of rapport and a sense of an exclusive relationship—was found to be the most frequent process and to correlate with the others. Compliance testing refers to repeatedly probing a target’s boundaries and then retreating to gauge and condition responses, while isolation works to separate the target from sources of support and to concentrate the interaction within the dyad. Because these processes can unfold across multiple turns rather than at fixed conversational positions, the framework provides a strong rationale for studying cross-turn evidence and interaction trajectories.</w:t>
-      </w:r>
-    </w:p>
-    <w:p>
-      <w:pPr>
-        <w:pStyle w:val="BodyText"/>
-      </w:pPr>
-      <w:r>
-        <w:t xml:space="preserve">OGDM supplies the theoretical reason to examine evidence across a conversation rather than treating turns as independent observations. The implemented trajectory features translate that general sequence-oriented rationale into inspectable computational signals: proxy-score level and change, threshold-crossing patterns, semantic distance from a training-derived benign centroid, and speaker-turn imbalance. These features are not direct measurements of OGDM stages or communicative processes, because PAN12 does not provide the message-level discourse annotations needed to validate such a mapping. Their empirical role is therefore tested through the matched comparison between recurrent and static aggregation, while OGDM remains the interpretive framework for why cross-turn dynamics may matter.</w:t>
-      </w:r>
-    </w:p>
-    <w:p>
-      <w:pPr>
-        <w:pStyle w:val="BodyText"/>
-      </w:pPr>
-      <w:r>
-        <w:t xml:space="preserve">Recent moderation frameworks adopt sequence modeling techniques, which evaluate conversations as evolving interaction chains rather than isolated textual inputs [6]. This approach allows systems to detect behavioral trajectories characteristic of grooming related activities, such as gradual trust-building, self-disclosure, or attempts to isolate users within private communication channels.</w:t>
-      </w:r>
-    </w:p>
-    <w:p>
-      <w:pPr>
-        <w:pStyle w:val="BodyText"/>
-      </w:pPr>
-      <w:r>
-        <w:t xml:space="preserve">However, current methodologies often evaluate text-based data in isolation and may fail to capture longer conversational progression across message turns. Multimodal behavioral indicators, such as spatial interaction patterns or economic incentives within digital environments, remain outside the scope of the present study and are recommended for future work.</w:t>
-      </w:r>
-    </w:p>
-    <w:p>
-      <w:pPr>
-        <w:pStyle w:val="BodyText"/>
-      </w:pPr>
-      <w:r>
-        <w:t xml:space="preserve">These limitations reveal a methodological gap in existing moderation systems, particularly in detecting slow-developing threats such as grooming behavior, which typically manifest through subtle interaction patterns across multiple messages rather than explicit rule violations.</w:t>
-      </w:r>
-    </w:p>
-    <w:p>
-      <w:pPr>
-        <w:pStyle w:val="BodyText"/>
-      </w:pPr>
-      <w:r>
-        <w:t xml:space="preserve">To address these challenges, contemporary research recommends hybrid moderation frameworks combining automated AI-based triage with human-in-the-loop (HITL) review mechanisms. Such layered architectures enable high-speed real-time flagging of suspicious interactions while preserving human oversight for nuanced adjudication and minimizing algorithmic bias.</w:t>
-      </w:r>
-    </w:p>
-    <w:p>
-      <w:pPr>
-        <w:pStyle w:val="BodyText"/>
-      </w:pPr>
-      <w:r>
-        <w:t xml:space="preserve">This study adopts the sequence-oriented implication of these theoretical principles by modeling how contextual proxy evidence and interaction structure change across turns. The resulting trajectory variables are computational features for the PAN12 endpoint, not validated OGDM stage labels. This distinction preserves a clear boundary between the discourse theory that motivates temporal analysis and the supervised evidence available for evaluating the system.</w:t>
+        <w:t>2.3 Theoretical Background</w:t>
+      </w:r>
+    </w:p>
+    <w:p>
+      <w:pPr>
+        <w:pStyle w:val="FirstParagraph"/>
+      </w:pPr>
+      <w:r>
+        <w:t>The theoretical foundation of this study combines machine-learning sequence modeling with discourse-based accounts of how grooming-related behavior develops across conversation.</w:t>
+      </w:r>
+    </w:p>
+    <w:p>
+      <w:pPr>
+        <w:pStyle w:val="FirstParagraph"/>
+      </w:pPr>
+      <w:r>
+        <w:t>O'Connell [12] provided an influential early typology of online grooming, describing a progression through friendship forming, relationship forming, risk assessment, exclusivity, and sexual stages. This framework established that grooming should be understood as a developing interaction rather than a collection of independent messages. Later research, however, showed that offenders do not necessarily follow one fixed linear order.</w:t>
+      </w:r>
+    </w:p>
+    <w:p>
+      <w:pPr>
+        <w:pStyle w:val="FirstParagraph"/>
+      </w:pPr>
+      <w:r>
+        <w:t>The principal theoretical framework adopted in this study is the Online Grooming Discourse Model developed by Lorenzo-Dus, Izura, and Perez-Tattam [11]. Based on a large corpus of offender chat logs, OGDM describes grooming as an entrapment network realized through four interrelated communicative processes: deceptive trust development, sexual gratification, compliance testing, and isolation. Deceptive trust development concerns the discursive construction of rapport and an exclusive relationship. Compliance testing involves probing boundaries and adjusting behavior in response, while isolation concentrates the interaction within the dyad and weakens external sources of support.</w:t>
+      </w:r>
+    </w:p>
+    <w:p>
+      <w:pPr>
+        <w:pStyle w:val="FirstParagraph"/>
+      </w:pPr>
+      <w:r>
+        <w:t>OGDM provides a strong theoretical reason to examine interaction trajectories. Its processes may emerge gradually, recur, overlap, or change direction across multiple turns. Consequently, a moderation model that retains conversational history and models changes over time is better aligned with the discourse structure of grooming than a system limited to isolated keywords.</w:t>
+      </w:r>
+    </w:p>
+    <w:p>
+      <w:pPr>
+        <w:pStyle w:val="FirstParagraph"/>
+      </w:pPr>
+      <w:r>
+        <w:t>The study translates this theoretical orientation into computationally inspectable trajectory signals. Proxy-score level and change represent the accumulation and fluctuation of contextual evidence; spike and spike-then-drop features represent abrupt increases and subsequent retreat; semantic distance from a training-derived benign centroid represents movement away from ordinary conversational content; and cumulative turn-taking imbalance represents asymmetry in participation. These features are theoretically informed behavioral indicators, not direct annotations of OGDM processes. PAN12 does not contain the independently reviewed discourse-stage labels required to establish that a specific feature occurrence is an instance of compliance testing, isolation, or another OGDM process.</w:t>
+      </w:r>
+    </w:p>
+    <w:p>
+      <w:pPr>
+        <w:pStyle w:val="FirstParagraph"/>
+      </w:pPr>
+      <w:r>
+        <w:t>This distinction does not remove the theoretical contribution. OGDM guides why cross-turn dynamics are modeled, which forms of progression are considered relevant, and why a recurrent architecture is appropriate. The empirical experiment then tests whether the resulting sequence representation improves conversation-level detection compared with static aggregation. The theory informs feature design and architectural hypotheses; the PAN12 endpoint evaluates predictive performance.</w:t>
+      </w:r>
+    </w:p>
+    <w:p>
+      <w:pPr>
+        <w:pStyle w:val="FirstParagraph"/>
+      </w:pPr>
+      <w:r>
+        <w:t>Sequence-learning theory provides the computational complement to OGDM. LSTMs are designed to preserve and update information across ordered observations, allowing the model to learn whether the order, persistence, and interaction of trajectory signals contribute to a final decision. The matched comparison with a weighted scorer tests this proposition directly because both methods receive the same seven inputs, while only the LSTM learns recurrent aggregation.</w:t>
+      </w:r>
+    </w:p>
+    <w:p>
+      <w:pPr>
+        <w:pStyle w:val="FirstParagraph"/>
+      </w:pPr>
+      <w:r>
+        <w:t>Current moderation research also supports hybrid systems that combine automated triage with human review. Such systems can process large volumes of communication while reserving contextual judgment and consequential decisions for qualified moderators. This layered principle is reflected in the proposed module: contextual and behavioral modeling supports prioritization, while the prototype does not claim autonomous determination of intent or guilt.</w:t>
+      </w:r>
+    </w:p>
+    <w:p>
+      <w:pPr>
+        <w:pStyle w:val="FirstParagraph"/>
+      </w:pPr>
+      <w:r>
+        <w:t>Together, OGDM, contextual NLP, behavioral analysis, and recurrent sequence learning establish a coherent foundation for the study. The proposed module operationalizes that foundation through a two-layer architecture that integrates conversational history, interpretable trajectory features, and learned temporal aggregation to enhance existing chat-moderation approaches.</w:t>
       </w:r>
     </w:p>
     <w:p>
       <w:pPr>
         <w:rPr>
-          <w:lang w:val="en-PH"/>
+          <w:rFonts w:eastAsia="Aptos" w:cs="Aptos"/>
         </w:rPr>
       </w:pPr>
       <w:r>
         <w:rPr>
-          <w:lang w:val="en-PH"/>
+          <w:rFonts w:eastAsia="Aptos" w:cs="Aptos"/>
         </w:rPr>
         <w:br w:type="page"/>
       </w:r>

</xml_diff>